<commit_message>
fix: actualización de la plantilla de carta al tutorado
</commit_message>
<xml_diff>
--- a/coda-src/plantillas_ejemplo/carta_asignacion_alumno_plantilla.docx
+++ b/coda-src/plantillas_ejemplo/carta_asignacion_alumno_plantilla.docx
@@ -344,17 +344,104 @@
           <w:sz w:val="22"/>
           <w:szCs w:val="22"/>
         </w:rPr>
-        <w:t xml:space="preserve">. La tutoría es parte del del Sistema de Acompañamiento Estudiantil que desarrolla la Universidad Autónoma Metropolitana Unidad Cuajimalpa; así mismo, le informo que tiene que establecer contacto a la brevedad con su tutor a través del formato electrónico ubicado en la página de la CODDAA </w:t>
+        <w:t>. La tutoría es parte del del Sistema de Acompañamiento Estudiantil que desarrolla la Universidad Autónoma Metropolitana Unidad Cuajimalpa.</w:t>
+      </w:r>
+    </w:p>
+    <w:p>
+      <w:pPr>
+        <w:pStyle w:val="normal1"/>
+        <w:jc w:val="both"/>
+        <w:rPr>
+          <w:color w:val="4472C4"/>
+          <w:sz w:val="28"/>
+          <w:szCs w:val="28"/>
+        </w:rPr>
+      </w:pPr>
+      <w:r>
+        <w:rPr>
+          <w:rFonts w:eastAsia="Arial" w:cs="Arial" w:ascii="Arial" w:hAnsi="Arial"/>
+          <w:sz w:val="22"/>
+          <w:szCs w:val="22"/>
+        </w:rPr>
+      </w:r>
+    </w:p>
+    <w:p>
+      <w:pPr>
+        <w:pStyle w:val="normal1"/>
+        <w:bidi w:val="0"/>
+        <w:jc w:val="both"/>
+        <w:rPr>
+          <w:color w:val="4472C4"/>
+          <w:sz w:val="28"/>
+          <w:szCs w:val="28"/>
+        </w:rPr>
+      </w:pPr>
+      <w:r>
+        <w:rPr>
+          <w:rFonts w:eastAsia="Arial" w:cs="Arial" w:ascii="Arial" w:hAnsi="Arial"/>
+          <w:sz w:val="22"/>
+          <w:szCs w:val="22"/>
+        </w:rPr>
+        <w:t>Asimismo</w:t>
+      </w:r>
+      <w:r>
+        <w:rPr>
+          <w:rFonts w:eastAsia="Arial" w:cs="Arial" w:ascii="Arial" w:hAnsi="Arial"/>
+          <w:sz w:val="22"/>
+          <w:szCs w:val="22"/>
+        </w:rPr>
+        <w:t xml:space="preserve">, le informo que </w:t>
+      </w:r>
+      <w:r>
+        <w:rPr>
+          <w:rFonts w:eastAsia="Arial" w:cs="Arial" w:ascii="Arial" w:hAnsi="Arial"/>
+          <w:sz w:val="22"/>
+          <w:szCs w:val="22"/>
+        </w:rPr>
+        <w:t xml:space="preserve">puede solicitar tutorías con {tutor} </w:t>
+      </w:r>
+      <w:r>
+        <w:rPr>
+          <w:rFonts w:eastAsia="Arial" w:cs="Arial" w:ascii="Arial" w:hAnsi="Arial"/>
+          <w:sz w:val="22"/>
+          <w:szCs w:val="22"/>
+        </w:rPr>
+        <w:t xml:space="preserve">a través </w:t>
+      </w:r>
+      <w:r>
+        <w:rPr>
+          <w:rFonts w:eastAsia="Arial" w:cs="Arial" w:ascii="Arial" w:hAnsi="Arial"/>
+          <w:sz w:val="22"/>
+          <w:szCs w:val="22"/>
+        </w:rPr>
+        <w:t>del Sistema de tutorías de la DCNI</w:t>
+      </w:r>
+      <w:r>
+        <w:rPr>
+          <w:rFonts w:eastAsia="Arial" w:cs="Arial" w:ascii="Arial" w:hAnsi="Arial"/>
+          <w:sz w:val="22"/>
+          <w:szCs w:val="22"/>
+        </w:rPr>
+        <w:t xml:space="preserve"> </w:t>
+      </w:r>
+      <w:r>
+        <w:rPr>
+          <w:rFonts w:eastAsia="Arial" w:cs="Arial" w:ascii="Arial" w:hAnsi="Arial"/>
+          <w:sz w:val="22"/>
+          <w:szCs w:val="22"/>
+        </w:rPr>
+        <w:t xml:space="preserve">en la dirección: </w:t>
       </w:r>
       <w:hyperlink r:id="rId2">
         <w:r>
           <w:rPr>
-            <w:rStyle w:val="Style3"/>
+            <w:rStyle w:val="Hyperlink"/>
+            <w:rFonts w:eastAsia="Arial" w:cs="Arial" w:ascii="Arial" w:hAnsi="Arial"/>
             <w:color w:val="4472C4"/>
             <w:sz w:val="28"/>
             <w:szCs w:val="28"/>
           </w:rPr>
-          <w:t>http://dcni.cua.uam.mx/coddaa/</w:t>
+          <w:t>https://tutordcni.cua.uam.mx/</w:t>
         </w:r>
       </w:hyperlink>
     </w:p>
@@ -1610,6 +1697,7 @@
     <w:name w:val="Normal"/>
     <w:pPr>
       <w:widowControl/>
+      <w:suppressAutoHyphens w:val="true"/>
       <w:bidi w:val="0"/>
       <w:spacing w:before="0" w:after="0"/>
       <w:jc w:val="start"/>
@@ -1859,6 +1947,7 @@
     <w:name w:val="normal1"/>
     <w:pPr>
       <w:widowControl/>
+      <w:suppressAutoHyphens w:val="true"/>
       <w:bidi w:val="0"/>
       <w:spacing w:before="0" w:after="0"/>
       <w:jc w:val="start"/>

</xml_diff>